<commit_message>
edit [worksheet - w6]
</commit_message>
<xml_diff>
--- a/1-G-1/6-week-6/4-worksheet/Computer Worksheet G1 W6.docx
+++ b/1-G-1/6-week-6/4-worksheet/Computer Worksheet G1 W6.docx
@@ -191,7 +191,6 @@
                 <w:bCs/>
                 <w:sz w:val="28"/>
                 <w:szCs w:val="28"/>
-                <w:lang w:val="en-GB"/>
               </w:rPr>
             </w:pPr>
             <w:r>
@@ -516,6 +515,151 @@
           <w:szCs w:val="36"/>
         </w:rPr>
       </w:pPr>
+      <w:r>
+        <w:rPr>
+          <w:rFonts w:ascii="Lucida Bright" w:hAnsi="Lucida Bright"/>
+          <w:noProof/>
+          <w:sz w:val="36"/>
+          <w:szCs w:val="36"/>
+        </w:rPr>
+        <mc:AlternateContent>
+          <mc:Choice Requires="wps">
+            <w:drawing>
+              <wp:anchor distT="0" distB="0" distL="114300" distR="114300" simplePos="0" relativeHeight="251724288" behindDoc="0" locked="0" layoutInCell="1" allowOverlap="1" wp14:anchorId="13133553" wp14:editId="5FD848F8">
+                <wp:simplePos x="0" y="0"/>
+                <wp:positionH relativeFrom="column">
+                  <wp:posOffset>137160</wp:posOffset>
+                </wp:positionH>
+                <wp:positionV relativeFrom="paragraph">
+                  <wp:posOffset>114935</wp:posOffset>
+                </wp:positionV>
+                <wp:extent cx="1863090" cy="1333500"/>
+                <wp:effectExtent l="19050" t="0" r="784860" b="38100"/>
+                <wp:wrapNone/>
+                <wp:docPr id="1398981530" name="Thought Bubble: Cloud 11"/>
+                <wp:cNvGraphicFramePr/>
+                <a:graphic xmlns:a="http://schemas.openxmlformats.org/drawingml/2006/main">
+                  <a:graphicData uri="http://schemas.microsoft.com/office/word/2010/wordprocessingShape">
+                    <wps:wsp>
+                      <wps:cNvSpPr/>
+                      <wps:spPr>
+                        <a:xfrm>
+                          <a:off x="0" y="0"/>
+                          <a:ext cx="1863090" cy="1333500"/>
+                        </a:xfrm>
+                        <a:prstGeom prst="cloudCallout">
+                          <a:avLst>
+                            <a:gd name="adj1" fmla="val 88390"/>
+                            <a:gd name="adj2" fmla="val 45357"/>
+                          </a:avLst>
+                        </a:prstGeom>
+                      </wps:spPr>
+                      <wps:style>
+                        <a:lnRef idx="2">
+                          <a:schemeClr val="accent1">
+                            <a:shade val="15000"/>
+                          </a:schemeClr>
+                        </a:lnRef>
+                        <a:fillRef idx="1">
+                          <a:schemeClr val="accent1"/>
+                        </a:fillRef>
+                        <a:effectRef idx="0">
+                          <a:schemeClr val="accent1"/>
+                        </a:effectRef>
+                        <a:fontRef idx="minor">
+                          <a:schemeClr val="lt1"/>
+                        </a:fontRef>
+                      </wps:style>
+                      <wps:txbx>
+                        <w:txbxContent>
+                          <w:p>
+                            <w:pPr>
+                              <w:jc w:val="center"/>
+                            </w:pPr>
+                          </w:p>
+                        </w:txbxContent>
+                      </wps:txbx>
+                      <wps:bodyPr rot="0" spcFirstLastPara="0" vertOverflow="overflow" horzOverflow="overflow" vert="horz" wrap="square" lIns="91440" tIns="45720" rIns="91440" bIns="45720" numCol="1" spcCol="0" rtlCol="1" fromWordArt="0" anchor="ctr" anchorCtr="0" forceAA="0" compatLnSpc="1">
+                        <a:prstTxWarp prst="textNoShape">
+                          <a:avLst/>
+                        </a:prstTxWarp>
+                        <a:noAutofit/>
+                      </wps:bodyPr>
+                    </wps:wsp>
+                  </a:graphicData>
+                </a:graphic>
+                <wp14:sizeRelH relativeFrom="margin">
+                  <wp14:pctWidth>0</wp14:pctWidth>
+                </wp14:sizeRelH>
+              </wp:anchor>
+            </w:drawing>
+          </mc:Choice>
+          <mc:Fallback>
+            <w:pict>
+              <v:shapetype w14:anchorId="13133553" id="_x0000_t106" coordsize="21600,21600" o:spt="106" adj="1350,25920" path="ar,7165,4345,13110,1950,7185,1080,12690,475,11732,4835,17650,1080,12690,2910,17640,2387,9757,10107,20300,2910,17640,8235,19545,7660,12382,14412,21597,8235,19545,14280,18330,12910,11080,18695,18947,14280,18330,18690,15045,14822,5862,21597,15082,18690,15045,20895,7665,15772,2592,21105,9865,20895,7665,19140,2715,14330,,19187,6595,19140,2715,14910,1170,10992,,15357,5945,14910,1170,11250,1665,6692,650,12025,7917,11250,1665,7005,2580,1912,1972,8665,11162,7005,2580,1950,7185xear,7165,4345,13110,1080,12690,2340,13080nfear475,11732,4835,17650,2910,17640,3465,17445nfear7660,12382,14412,21597,7905,18675,8235,19545nfear7660,12382,14412,21597,14280,18330,14400,17370nfear12910,11080,18695,18947,18690,15045,17070,11475nfear15772,2592,21105,9865,20175,9015,20895,7665nfear14330,,19187,6595,19200,3345,19140,2715nfear14330,,19187,6595,14910,1170,14550,1980nfear10992,,15357,5945,11250,1665,11040,2340nfear1912,1972,8665,11162,7650,3270,7005,2580nfear1912,1972,8665,11162,1950,7185,2070,7890nfem@23@37qx@35@24@23@36@34@24@23@37xem@16@33qx@31@17@16@32@30@17@16@33xem@38@29qx@27@39@38@28@26@39@38@29xe">
+                <v:formulas>
+                  <v:f eqn="sum #0 0 10800"/>
+                  <v:f eqn="sum #1 0 10800"/>
+                  <v:f eqn="cosatan2 10800 @0 @1"/>
+                  <v:f eqn="sinatan2 10800 @0 @1"/>
+                  <v:f eqn="sum @2 10800 0"/>
+                  <v:f eqn="sum @3 10800 0"/>
+                  <v:f eqn="sum @4 0 #0"/>
+                  <v:f eqn="sum @5 0 #1"/>
+                  <v:f eqn="mod @6 @7 0"/>
+                  <v:f eqn="prod 600 11 1"/>
+                  <v:f eqn="sum @8 0 @9"/>
+                  <v:f eqn="prod @10 1 3"/>
+                  <v:f eqn="prod 600 3 1"/>
+                  <v:f eqn="sum @11 @12 0"/>
+                  <v:f eqn="prod @13 @6 @8"/>
+                  <v:f eqn="prod @13 @7 @8"/>
+                  <v:f eqn="sum @14 #0 0"/>
+                  <v:f eqn="sum @15 #1 0"/>
+                  <v:f eqn="prod 600 8 1"/>
+                  <v:f eqn="prod @11 2 1"/>
+                  <v:f eqn="sum @18 @19 0"/>
+                  <v:f eqn="prod @20 @6 @8"/>
+                  <v:f eqn="prod @20 @7 @8"/>
+                  <v:f eqn="sum @21 #0 0"/>
+                  <v:f eqn="sum @22 #1 0"/>
+                  <v:f eqn="prod 600 2 1"/>
+                  <v:f eqn="sum #0 600 0"/>
+                  <v:f eqn="sum #0 0 600"/>
+                  <v:f eqn="sum #1 600 0"/>
+                  <v:f eqn="sum #1 0 600"/>
+                  <v:f eqn="sum @16 @25 0"/>
+                  <v:f eqn="sum @16 0 @25"/>
+                  <v:f eqn="sum @17 @25 0"/>
+                  <v:f eqn="sum @17 0 @25"/>
+                  <v:f eqn="sum @23 @12 0"/>
+                  <v:f eqn="sum @23 0 @12"/>
+                  <v:f eqn="sum @24 @12 0"/>
+                  <v:f eqn="sum @24 0 @12"/>
+                  <v:f eqn="val #0"/>
+                  <v:f eqn="val #1"/>
+                </v:formulas>
+                <v:path o:extrusionok="f" o:connecttype="custom" o:connectlocs="67,10800;10800,21577;21582,10800;10800,1235;@38,@39" textboxrect="2977,3262,17087,17337"/>
+                <v:handles>
+                  <v:h position="#0,#1"/>
+                </v:handles>
+                <o:complex v:ext="view"/>
+              </v:shapetype>
+              <v:shape id="Thought Bubble: Cloud 11" o:spid="_x0000_s1026" type="#_x0000_t106" style="position:absolute;margin-left:10.8pt;margin-top:9.05pt;width:146.7pt;height:105pt;z-index:251724288;visibility:visible;mso-wrap-style:square;mso-width-percent:0;mso-wrap-distance-left:9pt;mso-wrap-distance-top:0;mso-wrap-distance-right:9pt;mso-wrap-distance-bottom:0;mso-position-horizontal:absolute;mso-position-horizontal-relative:text;mso-position-vertical:absolute;mso-position-vertical-relative:text;mso-width-percent:0;mso-width-relative:margin;v-text-anchor:middle" o:gfxdata="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" adj="29892,20597" fillcolor="#4f81bd [3204]" strokecolor="#0a121c [484]" strokeweight="2pt">
+                <v:textbox>
+                  <w:txbxContent>
+                    <w:p>
+                      <w:pPr>
+                        <w:jc w:val="center"/>
+                      </w:pPr>
+                    </w:p>
+                  </w:txbxContent>
+                </v:textbox>
+              </v:shape>
+            </w:pict>
+          </mc:Fallback>
+        </mc:AlternateContent>
+      </w:r>
     </w:p>
     <w:p>
       <w:pPr>
@@ -524,6 +668,7 @@
           <w:rFonts w:ascii="Lucida Bright" w:hAnsi="Lucida Bright"/>
           <w:sz w:val="36"/>
           <w:szCs w:val="36"/>
+          <w:lang w:val="en-GB"/>
         </w:rPr>
       </w:pPr>
       <w:r>
@@ -535,7 +680,7 @@
           <w:lang w:val="en-GB" w:eastAsia="en-GB"/>
         </w:rPr>
         <w:drawing>
-          <wp:anchor distT="0" distB="0" distL="114300" distR="114300" simplePos="0" relativeHeight="251667968" behindDoc="1" locked="0" layoutInCell="1" allowOverlap="1" wp14:anchorId="4D6F7E4C" wp14:editId="171071E6">
+          <wp:anchor distT="0" distB="0" distL="114300" distR="114300" simplePos="0" relativeHeight="251654656" behindDoc="1" locked="0" layoutInCell="1" allowOverlap="1" wp14:anchorId="4D6F7E4C" wp14:editId="75AF10F3">
             <wp:simplePos x="0" y="0"/>
             <wp:positionH relativeFrom="column">
               <wp:posOffset>1543050</wp:posOffset>
@@ -597,58 +742,283 @@
           </wp:anchor>
         </w:drawing>
       </w:r>
+    </w:p>
+    <w:p>
+      <w:pPr>
+        <w:bidi w:val="0"/>
+        <w:rPr>
+          <w:rFonts w:ascii="Lucida Bright" w:hAnsi="Lucida Bright"/>
+          <w:sz w:val="36"/>
+          <w:szCs w:val="36"/>
+        </w:rPr>
+      </w:pPr>
       <w:r>
         <w:rPr>
           <w:rFonts w:ascii="Lucida Bright" w:hAnsi="Lucida Bright"/>
           <w:noProof/>
           <w:sz w:val="36"/>
           <w:szCs w:val="36"/>
-          <w:lang w:val="en-GB" w:eastAsia="en-GB"/>
         </w:rPr>
         <mc:AlternateContent>
           <mc:Choice Requires="wps">
             <w:drawing>
-              <wp:anchor distT="0" distB="0" distL="114300" distR="114300" simplePos="0" relativeHeight="251673088" behindDoc="0" locked="0" layoutInCell="1" allowOverlap="1" wp14:anchorId="57230F0A" wp14:editId="72A53B6F">
+              <wp:anchor distT="0" distB="0" distL="114300" distR="114300" simplePos="0" relativeHeight="251664896" behindDoc="0" locked="0" layoutInCell="1" allowOverlap="1" wp14:anchorId="5D818B62" wp14:editId="4C467EF0">
                 <wp:simplePos x="0" y="0"/>
                 <wp:positionH relativeFrom="column">
-                  <wp:posOffset>3445510</wp:posOffset>
+                  <wp:posOffset>1253490</wp:posOffset>
                 </wp:positionH>
                 <wp:positionV relativeFrom="paragraph">
-                  <wp:posOffset>190500</wp:posOffset>
+                  <wp:posOffset>3355975</wp:posOffset>
                 </wp:positionV>
-                <wp:extent cx="0" cy="361950"/>
-                <wp:effectExtent l="76200" t="19050" r="76200" b="95250"/>
+                <wp:extent cx="2312670" cy="1249680"/>
+                <wp:effectExtent l="19050" t="0" r="811530" b="45720"/>
                 <wp:wrapNone/>
-                <wp:docPr id="138951740" name="Straight Connector 138951740"/>
+                <wp:docPr id="764928558" name="Thought Bubble: Cloud 13"/>
                 <wp:cNvGraphicFramePr/>
                 <a:graphic xmlns:a="http://schemas.openxmlformats.org/drawingml/2006/main">
                   <a:graphicData uri="http://schemas.microsoft.com/office/word/2010/wordprocessingShape">
                     <wps:wsp>
-                      <wps:cNvCnPr/>
+                      <wps:cNvSpPr/>
                       <wps:spPr>
                         <a:xfrm>
                           <a:off x="0" y="0"/>
-                          <a:ext cx="0" cy="361950"/>
+                          <a:ext cx="2312670" cy="1249680"/>
                         </a:xfrm>
-                        <a:prstGeom prst="line">
-                          <a:avLst/>
+                        <a:prstGeom prst="cloudCallout">
+                          <a:avLst>
+                            <a:gd name="adj1" fmla="val 82870"/>
+                            <a:gd name="adj2" fmla="val -42988"/>
+                          </a:avLst>
                         </a:prstGeom>
                       </wps:spPr>
                       <wps:style>
-                        <a:lnRef idx="3">
-                          <a:schemeClr val="dk1"/>
+                        <a:lnRef idx="2">
+                          <a:schemeClr val="accent1">
+                            <a:shade val="15000"/>
+                          </a:schemeClr>
                         </a:lnRef>
-                        <a:fillRef idx="0">
-                          <a:schemeClr val="dk1"/>
+                        <a:fillRef idx="1">
+                          <a:schemeClr val="accent1"/>
                         </a:fillRef>
-                        <a:effectRef idx="2">
-                          <a:schemeClr val="dk1"/>
+                        <a:effectRef idx="0">
+                          <a:schemeClr val="accent1"/>
                         </a:effectRef>
                         <a:fontRef idx="minor">
-                          <a:schemeClr val="tx1"/>
+                          <a:schemeClr val="lt1"/>
                         </a:fontRef>
                       </wps:style>
-                      <wps:bodyPr/>
+                      <wps:txbx>
+                        <w:txbxContent>
+                          <w:p>
+                            <w:pPr>
+                              <w:jc w:val="center"/>
+                            </w:pPr>
+                          </w:p>
+                        </w:txbxContent>
+                      </wps:txbx>
+                      <wps:bodyPr rot="0" spcFirstLastPara="0" vertOverflow="overflow" horzOverflow="overflow" vert="horz" wrap="square" lIns="91440" tIns="45720" rIns="91440" bIns="45720" numCol="1" spcCol="0" rtlCol="1" fromWordArt="0" anchor="ctr" anchorCtr="0" forceAA="0" compatLnSpc="1">
+                        <a:prstTxWarp prst="textNoShape">
+                          <a:avLst/>
+                        </a:prstTxWarp>
+                        <a:noAutofit/>
+                      </wps:bodyPr>
+                    </wps:wsp>
+                  </a:graphicData>
+                </a:graphic>
+                <wp14:sizeRelH relativeFrom="margin">
+                  <wp14:pctWidth>0</wp14:pctWidth>
+                </wp14:sizeRelH>
+              </wp:anchor>
+            </w:drawing>
+          </mc:Choice>
+          <mc:Fallback>
+            <w:pict>
+              <v:shape w14:anchorId="5D818B62" id="Thought Bubble: Cloud 13" o:spid="_x0000_s1027" type="#_x0000_t106" style="position:absolute;margin-left:98.7pt;margin-top:264.25pt;width:182.1pt;height:98.4pt;z-index:251664896;visibility:visible;mso-wrap-style:square;mso-width-percent:0;mso-wrap-distance-left:9pt;mso-wrap-distance-top:0;mso-wrap-distance-right:9pt;mso-wrap-distance-bottom:0;mso-position-horizontal:absolute;mso-position-horizontal-relative:text;mso-position-vertical:absolute;mso-position-vertical-relative:text;mso-width-percent:0;mso-width-relative:margin;v-text-anchor:middle" o:gfxdata="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" adj="28700,1515" fillcolor="#4f81bd [3204]" strokecolor="#0a121c [484]" strokeweight="2pt">
+                <v:textbox>
+                  <w:txbxContent>
+                    <w:p>
+                      <w:pPr>
+                        <w:jc w:val="center"/>
+                      </w:pPr>
+                    </w:p>
+                  </w:txbxContent>
+                </v:textbox>
+              </v:shape>
+            </w:pict>
+          </mc:Fallback>
+        </mc:AlternateContent>
+      </w:r>
+      <w:r>
+        <w:rPr>
+          <w:rFonts w:ascii="Lucida Bright" w:hAnsi="Lucida Bright"/>
+          <w:noProof/>
+          <w:sz w:val="36"/>
+          <w:szCs w:val="36"/>
+        </w:rPr>
+        <mc:AlternateContent>
+          <mc:Choice Requires="wps">
+            <w:drawing>
+              <wp:anchor distT="0" distB="0" distL="114300" distR="114300" simplePos="0" relativeHeight="251666944" behindDoc="0" locked="0" layoutInCell="1" allowOverlap="1" wp14:anchorId="4CB8FD60" wp14:editId="5E9E27D1">
+                <wp:simplePos x="0" y="0"/>
+                <wp:positionH relativeFrom="column">
+                  <wp:posOffset>5231130</wp:posOffset>
+                </wp:positionH>
+                <wp:positionV relativeFrom="paragraph">
+                  <wp:posOffset>3721735</wp:posOffset>
+                </wp:positionV>
+                <wp:extent cx="1558290" cy="1524000"/>
+                <wp:effectExtent l="19050" t="419100" r="41910" b="38100"/>
+                <wp:wrapNone/>
+                <wp:docPr id="311867540" name="Thought Bubble: Cloud 14"/>
+                <wp:cNvGraphicFramePr/>
+                <a:graphic xmlns:a="http://schemas.openxmlformats.org/drawingml/2006/main">
+                  <a:graphicData uri="http://schemas.microsoft.com/office/word/2010/wordprocessingShape">
+                    <wps:wsp>
+                      <wps:cNvSpPr/>
+                      <wps:spPr>
+                        <a:xfrm>
+                          <a:off x="0" y="0"/>
+                          <a:ext cx="1558290" cy="1524000"/>
+                        </a:xfrm>
+                        <a:prstGeom prst="cloudCallout">
+                          <a:avLst>
+                            <a:gd name="adj1" fmla="val -6652"/>
+                            <a:gd name="adj2" fmla="val -73500"/>
+                          </a:avLst>
+                        </a:prstGeom>
+                      </wps:spPr>
+                      <wps:style>
+                        <a:lnRef idx="2">
+                          <a:schemeClr val="accent1">
+                            <a:shade val="15000"/>
+                          </a:schemeClr>
+                        </a:lnRef>
+                        <a:fillRef idx="1">
+                          <a:schemeClr val="accent1"/>
+                        </a:fillRef>
+                        <a:effectRef idx="0">
+                          <a:schemeClr val="accent1"/>
+                        </a:effectRef>
+                        <a:fontRef idx="minor">
+                          <a:schemeClr val="lt1"/>
+                        </a:fontRef>
+                      </wps:style>
+                      <wps:txbx>
+                        <w:txbxContent>
+                          <w:p>
+                            <w:pPr>
+                              <w:jc w:val="center"/>
+                            </w:pPr>
+                          </w:p>
+                        </w:txbxContent>
+                      </wps:txbx>
+                      <wps:bodyPr rot="0" spcFirstLastPara="0" vertOverflow="overflow" horzOverflow="overflow" vert="horz" wrap="square" lIns="91440" tIns="45720" rIns="91440" bIns="45720" numCol="1" spcCol="0" rtlCol="1" fromWordArt="0" anchor="ctr" anchorCtr="0" forceAA="0" compatLnSpc="1">
+                        <a:prstTxWarp prst="textNoShape">
+                          <a:avLst/>
+                        </a:prstTxWarp>
+                        <a:noAutofit/>
+                      </wps:bodyPr>
+                    </wps:wsp>
+                  </a:graphicData>
+                </a:graphic>
+                <wp14:sizeRelH relativeFrom="margin">
+                  <wp14:pctWidth>0</wp14:pctWidth>
+                </wp14:sizeRelH>
+              </wp:anchor>
+            </w:drawing>
+          </mc:Choice>
+          <mc:Fallback>
+            <w:pict>
+              <v:shape w14:anchorId="4CB8FD60" id="Thought Bubble: Cloud 14" o:spid="_x0000_s1028" type="#_x0000_t106" style="position:absolute;margin-left:411.9pt;margin-top:293.05pt;width:122.7pt;height:120pt;z-index:251666944;visibility:visible;mso-wrap-style:square;mso-width-percent:0;mso-wrap-distance-left:9pt;mso-wrap-distance-top:0;mso-wrap-distance-right:9pt;mso-wrap-distance-bottom:0;mso-position-horizontal:absolute;mso-position-horizontal-relative:text;mso-position-vertical:absolute;mso-position-vertical-relative:text;mso-width-percent:0;mso-width-relative:margin;v-text-anchor:middle" o:gfxdata="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" adj="9363,-5076" fillcolor="#4f81bd [3204]" strokecolor="#0a121c [484]" strokeweight="2pt">
+                <v:textbox>
+                  <w:txbxContent>
+                    <w:p>
+                      <w:pPr>
+                        <w:jc w:val="center"/>
+                      </w:pPr>
+                    </w:p>
+                  </w:txbxContent>
+                </v:textbox>
+              </v:shape>
+            </w:pict>
+          </mc:Fallback>
+        </mc:AlternateContent>
+      </w:r>
+      <w:r>
+        <w:rPr>
+          <w:rFonts w:ascii="Lucida Bright" w:hAnsi="Lucida Bright"/>
+          <w:noProof/>
+          <w:sz w:val="36"/>
+          <w:szCs w:val="36"/>
+        </w:rPr>
+        <mc:AlternateContent>
+          <mc:Choice Requires="wps">
+            <w:drawing>
+              <wp:anchor distT="0" distB="0" distL="114300" distR="114300" simplePos="0" relativeHeight="251725312" behindDoc="0" locked="0" layoutInCell="1" allowOverlap="1" wp14:anchorId="5301DE3A" wp14:editId="47C31BAA">
+                <wp:simplePos x="0" y="0"/>
+                <wp:positionH relativeFrom="column">
+                  <wp:posOffset>-46355</wp:posOffset>
+                </wp:positionH>
+                <wp:positionV relativeFrom="paragraph">
+                  <wp:posOffset>1862455</wp:posOffset>
+                </wp:positionV>
+                <wp:extent cx="1928429" cy="1196340"/>
+                <wp:effectExtent l="19050" t="0" r="1043940" b="41910"/>
+                <wp:wrapNone/>
+                <wp:docPr id="2050156439" name="Thought Bubble: Cloud 12"/>
+                <wp:cNvGraphicFramePr/>
+                <a:graphic xmlns:a="http://schemas.openxmlformats.org/drawingml/2006/main">
+                  <a:graphicData uri="http://schemas.microsoft.com/office/word/2010/wordprocessingShape">
+                    <wps:wsp>
+                      <wps:cNvSpPr/>
+                      <wps:spPr>
+                        <a:xfrm>
+                          <a:off x="0" y="0"/>
+                          <a:ext cx="1928429" cy="1196340"/>
+                        </a:xfrm>
+                        <a:prstGeom prst="cloudCallout">
+                          <a:avLst>
+                            <a:gd name="adj1" fmla="val 101688"/>
+                            <a:gd name="adj2" fmla="val 31903"/>
+                          </a:avLst>
+                        </a:prstGeom>
+                      </wps:spPr>
+                      <wps:style>
+                        <a:lnRef idx="2">
+                          <a:schemeClr val="accent1">
+                            <a:shade val="15000"/>
+                          </a:schemeClr>
+                        </a:lnRef>
+                        <a:fillRef idx="1">
+                          <a:schemeClr val="accent1"/>
+                        </a:fillRef>
+                        <a:effectRef idx="0">
+                          <a:schemeClr val="accent1"/>
+                        </a:effectRef>
+                        <a:fontRef idx="minor">
+                          <a:schemeClr val="lt1"/>
+                        </a:fontRef>
+                      </wps:style>
+                      <wps:txbx>
+                        <w:txbxContent>
+                          <w:p>
+                            <w:pPr>
+                              <w:jc w:val="center"/>
+                              <w:rPr>
+                                <w:rFonts w:hint="cs"/>
+                                <w:rtl/>
+                                <w:lang w:bidi="ar-EG"/>
+                              </w:rPr>
+                            </w:pPr>
+                          </w:p>
+                        </w:txbxContent>
+                      </wps:txbx>
+                      <wps:bodyPr rot="0" spcFirstLastPara="0" vertOverflow="overflow" horzOverflow="overflow" vert="horz" wrap="square" lIns="91440" tIns="45720" rIns="91440" bIns="45720" numCol="1" spcCol="0" rtlCol="1" fromWordArt="0" anchor="ctr" anchorCtr="0" forceAA="0" compatLnSpc="1">
+                        <a:prstTxWarp prst="textNoShape">
+                          <a:avLst/>
+                        </a:prstTxWarp>
+                        <a:noAutofit/>
+                      </wps:bodyPr>
                     </wps:wsp>
                   </a:graphicData>
                 </a:graphic>
@@ -663,9 +1033,22 @@
           </mc:Choice>
           <mc:Fallback>
             <w:pict>
-              <v:line w14:anchorId="66ED369C" id="Straight Connector 138951740" o:spid="_x0000_s1026" style="position:absolute;left:0;text-align:left;z-index:251673088;visibility:visible;mso-wrap-style:square;mso-width-percent:0;mso-height-percent:0;mso-wrap-distance-left:9pt;mso-wrap-distance-top:0;mso-wrap-distance-right:9pt;mso-wrap-distance-bottom:0;mso-position-horizontal:absolute;mso-position-horizontal-relative:text;mso-position-vertical:absolute;mso-position-vertical-relative:text;mso-width-percent:0;mso-height-percent:0;mso-width-relative:margin;mso-height-relative:margin" from="271.3pt,15pt" to="271.3pt,43.5pt" o:gfxdata="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" strokecolor="black [3200]" strokeweight="3pt">
-                <v:shadow on="t" color="black" opacity="22937f" origin=",.5" offset="0,.63889mm"/>
-              </v:line>
+              <v:shape w14:anchorId="5301DE3A" id="Thought Bubble: Cloud 12" o:spid="_x0000_s1029" type="#_x0000_t106" style="position:absolute;margin-left:-3.65pt;margin-top:146.65pt;width:151.85pt;height:94.2pt;z-index:251725312;visibility:visible;mso-wrap-style:square;mso-width-percent:0;mso-height-percent:0;mso-wrap-distance-left:9pt;mso-wrap-distance-top:0;mso-wrap-distance-right:9pt;mso-wrap-distance-bottom:0;mso-position-horizontal:absolute;mso-position-horizontal-relative:text;mso-position-vertical:absolute;mso-position-vertical-relative:text;mso-width-percent:0;mso-height-percent:0;mso-width-relative:margin;mso-height-relative:margin;v-text-anchor:middle" o:gfxdata="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" adj="32765,17691" fillcolor="#4f81bd [3204]" strokecolor="#0a121c [484]" strokeweight="2pt">
+                <v:textbox>
+                  <w:txbxContent>
+                    <w:p>
+                      <w:pPr>
+                        <w:jc w:val="center"/>
+                        <w:rPr>
+                          <w:rFonts w:hint="cs"/>
+                          <w:rtl/>
+                          <w:lang w:bidi="ar-EG"/>
+                        </w:rPr>
+                      </w:pPr>
+                    </w:p>
+                  </w:txbxContent>
+                </v:textbox>
+              </v:shape>
             </w:pict>
           </mc:Fallback>
         </mc:AlternateContent>
@@ -676,605 +1059,11 @@
           <w:noProof/>
           <w:sz w:val="36"/>
           <w:szCs w:val="36"/>
-          <w:lang w:val="en-GB" w:eastAsia="en-GB"/>
         </w:rPr>
         <mc:AlternateContent>
           <mc:Choice Requires="wps">
             <w:drawing>
-              <wp:anchor distT="0" distB="0" distL="114300" distR="114300" simplePos="0" relativeHeight="251658752" behindDoc="0" locked="0" layoutInCell="1" allowOverlap="1" wp14:anchorId="17A9EED2" wp14:editId="0731CEEC">
-                <wp:simplePos x="0" y="0"/>
-                <wp:positionH relativeFrom="column">
-                  <wp:posOffset>1666875</wp:posOffset>
-                </wp:positionH>
-                <wp:positionV relativeFrom="paragraph">
-                  <wp:posOffset>190500</wp:posOffset>
-                </wp:positionV>
-                <wp:extent cx="3562350" cy="0"/>
-                <wp:effectExtent l="57150" t="38100" r="57150" b="95250"/>
-                <wp:wrapNone/>
-                <wp:docPr id="61586729" name="Straight Connector 61586729"/>
-                <wp:cNvGraphicFramePr/>
-                <a:graphic xmlns:a="http://schemas.openxmlformats.org/drawingml/2006/main">
-                  <a:graphicData uri="http://schemas.microsoft.com/office/word/2010/wordprocessingShape">
-                    <wps:wsp>
-                      <wps:cNvCnPr/>
-                      <wps:spPr>
-                        <a:xfrm flipV="1">
-                          <a:off x="0" y="0"/>
-                          <a:ext cx="3562350" cy="0"/>
-                        </a:xfrm>
-                        <a:prstGeom prst="line">
-                          <a:avLst/>
-                        </a:prstGeom>
-                      </wps:spPr>
-                      <wps:style>
-                        <a:lnRef idx="3">
-                          <a:schemeClr val="dk1"/>
-                        </a:lnRef>
-                        <a:fillRef idx="0">
-                          <a:schemeClr val="dk1"/>
-                        </a:fillRef>
-                        <a:effectRef idx="2">
-                          <a:schemeClr val="dk1"/>
-                        </a:effectRef>
-                        <a:fontRef idx="minor">
-                          <a:schemeClr val="tx1"/>
-                        </a:fontRef>
-                      </wps:style>
-                      <wps:bodyPr/>
-                    </wps:wsp>
-                  </a:graphicData>
-                </a:graphic>
-                <wp14:sizeRelH relativeFrom="margin">
-                  <wp14:pctWidth>0</wp14:pctWidth>
-                </wp14:sizeRelH>
-                <wp14:sizeRelV relativeFrom="margin">
-                  <wp14:pctHeight>0</wp14:pctHeight>
-                </wp14:sizeRelV>
-              </wp:anchor>
-            </w:drawing>
-          </mc:Choice>
-          <mc:Fallback>
-            <w:pict>
-              <v:line w14:anchorId="4C6BFB44" id="Straight Connector 61586729" o:spid="_x0000_s1026" style="position:absolute;left:0;text-align:left;flip:y;z-index:251658752;visibility:visible;mso-wrap-style:square;mso-width-percent:0;mso-height-percent:0;mso-wrap-distance-left:9pt;mso-wrap-distance-top:0;mso-wrap-distance-right:9pt;mso-wrap-distance-bottom:0;mso-position-horizontal:absolute;mso-position-horizontal-relative:text;mso-position-vertical:absolute;mso-position-vertical-relative:text;mso-width-percent:0;mso-height-percent:0;mso-width-relative:margin;mso-height-relative:margin" from="131.25pt,15pt" to="411.75pt,15pt" o:gfxdata="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" strokecolor="black [3200]" strokeweight="3pt">
-                <v:shadow on="t" color="black" opacity="22937f" origin=",.5" offset="0,.63889mm"/>
-              </v:line>
-            </w:pict>
-          </mc:Fallback>
-        </mc:AlternateContent>
-      </w:r>
-    </w:p>
-    <w:p>
-      <w:pPr>
-        <w:bidi w:val="0"/>
-        <w:rPr>
-          <w:rFonts w:ascii="Lucida Bright" w:hAnsi="Lucida Bright"/>
-          <w:sz w:val="36"/>
-          <w:szCs w:val="36"/>
-        </w:rPr>
-      </w:pPr>
-      <w:r>
-        <w:rPr>
-          <w:rFonts w:ascii="Lucida Bright" w:hAnsi="Lucida Bright"/>
-          <w:noProof/>
-          <w:sz w:val="36"/>
-          <w:szCs w:val="36"/>
-          <w:lang w:val="en-GB" w:eastAsia="en-GB"/>
-        </w:rPr>
-        <mc:AlternateContent>
-          <mc:Choice Requires="wps">
-            <w:drawing>
-              <wp:anchor distT="0" distB="0" distL="114300" distR="114300" simplePos="0" relativeHeight="251680256" behindDoc="0" locked="0" layoutInCell="1" allowOverlap="1" wp14:anchorId="59333E00" wp14:editId="58273648">
-                <wp:simplePos x="0" y="0"/>
-                <wp:positionH relativeFrom="column">
-                  <wp:posOffset>4000500</wp:posOffset>
-                </wp:positionH>
-                <wp:positionV relativeFrom="paragraph">
-                  <wp:posOffset>3388359</wp:posOffset>
-                </wp:positionV>
-                <wp:extent cx="6985" cy="992505"/>
-                <wp:effectExtent l="76200" t="38100" r="69215" b="74295"/>
-                <wp:wrapNone/>
-                <wp:docPr id="1344193723" name="Straight Connector 1344193723"/>
-                <wp:cNvGraphicFramePr/>
-                <a:graphic xmlns:a="http://schemas.openxmlformats.org/drawingml/2006/main">
-                  <a:graphicData uri="http://schemas.microsoft.com/office/word/2010/wordprocessingShape">
-                    <wps:wsp>
-                      <wps:cNvCnPr/>
-                      <wps:spPr>
-                        <a:xfrm flipH="1" flipV="1">
-                          <a:off x="0" y="0"/>
-                          <a:ext cx="6985" cy="992505"/>
-                        </a:xfrm>
-                        <a:prstGeom prst="line">
-                          <a:avLst/>
-                        </a:prstGeom>
-                      </wps:spPr>
-                      <wps:style>
-                        <a:lnRef idx="3">
-                          <a:schemeClr val="dk1"/>
-                        </a:lnRef>
-                        <a:fillRef idx="0">
-                          <a:schemeClr val="dk1"/>
-                        </a:fillRef>
-                        <a:effectRef idx="2">
-                          <a:schemeClr val="dk1"/>
-                        </a:effectRef>
-                        <a:fontRef idx="minor">
-                          <a:schemeClr val="tx1"/>
-                        </a:fontRef>
-                      </wps:style>
-                      <wps:bodyPr/>
-                    </wps:wsp>
-                  </a:graphicData>
-                </a:graphic>
-                <wp14:sizeRelH relativeFrom="margin">
-                  <wp14:pctWidth>0</wp14:pctWidth>
-                </wp14:sizeRelH>
-                <wp14:sizeRelV relativeFrom="margin">
-                  <wp14:pctHeight>0</wp14:pctHeight>
-                </wp14:sizeRelV>
-              </wp:anchor>
-            </w:drawing>
-          </mc:Choice>
-          <mc:Fallback>
-            <w:pict>
-              <v:line w14:anchorId="52567C39" id="Straight Connector 1344193723" o:spid="_x0000_s1026" style="position:absolute;left:0;text-align:left;flip:x y;z-index:251680256;visibility:visible;mso-wrap-style:square;mso-width-percent:0;mso-height-percent:0;mso-wrap-distance-left:9pt;mso-wrap-distance-top:0;mso-wrap-distance-right:9pt;mso-wrap-distance-bottom:0;mso-position-horizontal:absolute;mso-position-horizontal-relative:text;mso-position-vertical:absolute;mso-position-vertical-relative:text;mso-width-percent:0;mso-height-percent:0;mso-width-relative:margin;mso-height-relative:margin" from="315pt,266.8pt" to="315.55pt,344.95pt" o:gfxdata="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" strokecolor="black [3200]" strokeweight="3pt">
-                <v:shadow on="t" color="black" opacity="22937f" origin=",.5" offset="0,.63889mm"/>
-              </v:line>
-            </w:pict>
-          </mc:Fallback>
-        </mc:AlternateContent>
-      </w:r>
-      <w:r>
-        <w:rPr>
-          <w:rFonts w:ascii="Lucida Bright" w:hAnsi="Lucida Bright"/>
-          <w:noProof/>
-          <w:sz w:val="36"/>
-          <w:szCs w:val="36"/>
-          <w:lang w:val="en-GB" w:eastAsia="en-GB"/>
-        </w:rPr>
-        <mc:AlternateContent>
-          <mc:Choice Requires="wps">
-            <w:drawing>
-              <wp:anchor distT="0" distB="0" distL="114300" distR="114300" simplePos="0" relativeHeight="251701760" behindDoc="0" locked="0" layoutInCell="1" allowOverlap="1" wp14:anchorId="6C5612AF" wp14:editId="1FBC570A">
-                <wp:simplePos x="0" y="0"/>
-                <wp:positionH relativeFrom="column">
-                  <wp:posOffset>6257925</wp:posOffset>
-                </wp:positionH>
-                <wp:positionV relativeFrom="paragraph">
-                  <wp:posOffset>3588385</wp:posOffset>
-                </wp:positionV>
-                <wp:extent cx="600075" cy="742950"/>
-                <wp:effectExtent l="76200" t="38100" r="66675" b="76200"/>
-                <wp:wrapNone/>
-                <wp:docPr id="1394029109" name="Straight Connector 1394029109"/>
-                <wp:cNvGraphicFramePr/>
-                <a:graphic xmlns:a="http://schemas.openxmlformats.org/drawingml/2006/main">
-                  <a:graphicData uri="http://schemas.microsoft.com/office/word/2010/wordprocessingShape">
-                    <wps:wsp>
-                      <wps:cNvCnPr/>
-                      <wps:spPr>
-                        <a:xfrm flipH="1" flipV="1">
-                          <a:off x="0" y="0"/>
-                          <a:ext cx="600075" cy="742950"/>
-                        </a:xfrm>
-                        <a:prstGeom prst="line">
-                          <a:avLst/>
-                        </a:prstGeom>
-                      </wps:spPr>
-                      <wps:style>
-                        <a:lnRef idx="3">
-                          <a:schemeClr val="dk1"/>
-                        </a:lnRef>
-                        <a:fillRef idx="0">
-                          <a:schemeClr val="dk1"/>
-                        </a:fillRef>
-                        <a:effectRef idx="2">
-                          <a:schemeClr val="dk1"/>
-                        </a:effectRef>
-                        <a:fontRef idx="minor">
-                          <a:schemeClr val="tx1"/>
-                        </a:fontRef>
-                      </wps:style>
-                      <wps:bodyPr/>
-                    </wps:wsp>
-                  </a:graphicData>
-                </a:graphic>
-                <wp14:sizeRelH relativeFrom="margin">
-                  <wp14:pctWidth>0</wp14:pctWidth>
-                </wp14:sizeRelH>
-                <wp14:sizeRelV relativeFrom="margin">
-                  <wp14:pctHeight>0</wp14:pctHeight>
-                </wp14:sizeRelV>
-              </wp:anchor>
-            </w:drawing>
-          </mc:Choice>
-          <mc:Fallback>
-            <w:pict>
-              <v:line w14:anchorId="6CDE5636" id="Straight Connector 1394029109" o:spid="_x0000_s1026" style="position:absolute;left:0;text-align:left;flip:x y;z-index:251701760;visibility:visible;mso-wrap-style:square;mso-width-percent:0;mso-height-percent:0;mso-wrap-distance-left:9pt;mso-wrap-distance-top:0;mso-wrap-distance-right:9pt;mso-wrap-distance-bottom:0;mso-position-horizontal:absolute;mso-position-horizontal-relative:text;mso-position-vertical:absolute;mso-position-vertical-relative:text;mso-width-percent:0;mso-height-percent:0;mso-width-relative:margin;mso-height-relative:margin" from="492.75pt,282.55pt" to="540pt,341.05pt" o:gfxdata="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" strokecolor="black [3200]" strokeweight="3pt">
-                <v:shadow on="t" color="black" opacity="22937f" origin=",.5" offset="0,.63889mm"/>
-              </v:line>
-            </w:pict>
-          </mc:Fallback>
-        </mc:AlternateContent>
-      </w:r>
-      <w:r>
-        <w:rPr>
-          <w:rFonts w:ascii="Lucida Bright" w:hAnsi="Lucida Bright"/>
-          <w:noProof/>
-          <w:sz w:val="36"/>
-          <w:szCs w:val="36"/>
-          <w:lang w:val="en-GB" w:eastAsia="en-GB"/>
-        </w:rPr>
-        <mc:AlternateContent>
-          <mc:Choice Requires="wps">
-            <w:drawing>
-              <wp:anchor distT="0" distB="0" distL="114300" distR="114300" simplePos="0" relativeHeight="251699712" behindDoc="0" locked="0" layoutInCell="1" allowOverlap="1" wp14:anchorId="703A1BD3" wp14:editId="37F27F92">
-                <wp:simplePos x="0" y="0"/>
-                <wp:positionH relativeFrom="column">
-                  <wp:posOffset>161924</wp:posOffset>
-                </wp:positionH>
-                <wp:positionV relativeFrom="paragraph">
-                  <wp:posOffset>3474085</wp:posOffset>
-                </wp:positionV>
-                <wp:extent cx="1647825" cy="0"/>
-                <wp:effectExtent l="57150" t="38100" r="66675" b="95250"/>
-                <wp:wrapNone/>
-                <wp:docPr id="1581571407" name="Straight Connector 1581571407"/>
-                <wp:cNvGraphicFramePr/>
-                <a:graphic xmlns:a="http://schemas.openxmlformats.org/drawingml/2006/main">
-                  <a:graphicData uri="http://schemas.microsoft.com/office/word/2010/wordprocessingShape">
-                    <wps:wsp>
-                      <wps:cNvCnPr/>
-                      <wps:spPr>
-                        <a:xfrm flipV="1">
-                          <a:off x="0" y="0"/>
-                          <a:ext cx="1647825" cy="0"/>
-                        </a:xfrm>
-                        <a:prstGeom prst="line">
-                          <a:avLst/>
-                        </a:prstGeom>
-                      </wps:spPr>
-                      <wps:style>
-                        <a:lnRef idx="3">
-                          <a:schemeClr val="dk1"/>
-                        </a:lnRef>
-                        <a:fillRef idx="0">
-                          <a:schemeClr val="dk1"/>
-                        </a:fillRef>
-                        <a:effectRef idx="2">
-                          <a:schemeClr val="dk1"/>
-                        </a:effectRef>
-                        <a:fontRef idx="minor">
-                          <a:schemeClr val="tx1"/>
-                        </a:fontRef>
-                      </wps:style>
-                      <wps:bodyPr/>
-                    </wps:wsp>
-                  </a:graphicData>
-                </a:graphic>
-                <wp14:sizeRelH relativeFrom="margin">
-                  <wp14:pctWidth>0</wp14:pctWidth>
-                </wp14:sizeRelH>
-                <wp14:sizeRelV relativeFrom="margin">
-                  <wp14:pctHeight>0</wp14:pctHeight>
-                </wp14:sizeRelV>
-              </wp:anchor>
-            </w:drawing>
-          </mc:Choice>
-          <mc:Fallback>
-            <w:pict>
-              <v:line w14:anchorId="534EEBC8" id="Straight Connector 1581571407" o:spid="_x0000_s1026" style="position:absolute;left:0;text-align:left;flip:y;z-index:251699712;visibility:visible;mso-wrap-style:square;mso-width-percent:0;mso-height-percent:0;mso-wrap-distance-left:9pt;mso-wrap-distance-top:0;mso-wrap-distance-right:9pt;mso-wrap-distance-bottom:0;mso-position-horizontal:absolute;mso-position-horizontal-relative:text;mso-position-vertical:absolute;mso-position-vertical-relative:text;mso-width-percent:0;mso-height-percent:0;mso-width-relative:margin;mso-height-relative:margin" from="12.75pt,273.55pt" to="142.5pt,273.55pt" o:gfxdata="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" strokecolor="black [3200]" strokeweight="3pt">
-                <v:shadow on="t" color="black" opacity="22937f" origin=",.5" offset="0,.63889mm"/>
-              </v:line>
-            </w:pict>
-          </mc:Fallback>
-        </mc:AlternateContent>
-      </w:r>
-      <w:r>
-        <w:rPr>
-          <w:rFonts w:ascii="Lucida Bright" w:hAnsi="Lucida Bright"/>
-          <w:noProof/>
-          <w:sz w:val="36"/>
-          <w:szCs w:val="36"/>
-          <w:lang w:val="en-GB" w:eastAsia="en-GB"/>
-        </w:rPr>
-        <mc:AlternateContent>
-          <mc:Choice Requires="wps">
-            <w:drawing>
-              <wp:anchor distT="0" distB="0" distL="114300" distR="114300" simplePos="0" relativeHeight="251690496" behindDoc="0" locked="0" layoutInCell="1" allowOverlap="1" wp14:anchorId="1984EE6C" wp14:editId="35930B2C">
-                <wp:simplePos x="0" y="0"/>
-                <wp:positionH relativeFrom="column">
-                  <wp:posOffset>1809750</wp:posOffset>
-                </wp:positionH>
-                <wp:positionV relativeFrom="paragraph">
-                  <wp:posOffset>2816859</wp:posOffset>
-                </wp:positionV>
-                <wp:extent cx="0" cy="657225"/>
-                <wp:effectExtent l="76200" t="38100" r="76200" b="66675"/>
-                <wp:wrapNone/>
-                <wp:docPr id="617658003" name="Straight Connector 617658003"/>
-                <wp:cNvGraphicFramePr/>
-                <a:graphic xmlns:a="http://schemas.openxmlformats.org/drawingml/2006/main">
-                  <a:graphicData uri="http://schemas.microsoft.com/office/word/2010/wordprocessingShape">
-                    <wps:wsp>
-                      <wps:cNvCnPr/>
-                      <wps:spPr>
-                        <a:xfrm flipV="1">
-                          <a:off x="0" y="0"/>
-                          <a:ext cx="0" cy="657225"/>
-                        </a:xfrm>
-                        <a:prstGeom prst="line">
-                          <a:avLst/>
-                        </a:prstGeom>
-                      </wps:spPr>
-                      <wps:style>
-                        <a:lnRef idx="3">
-                          <a:schemeClr val="dk1"/>
-                        </a:lnRef>
-                        <a:fillRef idx="0">
-                          <a:schemeClr val="dk1"/>
-                        </a:fillRef>
-                        <a:effectRef idx="2">
-                          <a:schemeClr val="dk1"/>
-                        </a:effectRef>
-                        <a:fontRef idx="minor">
-                          <a:schemeClr val="tx1"/>
-                        </a:fontRef>
-                      </wps:style>
-                      <wps:bodyPr/>
-                    </wps:wsp>
-                  </a:graphicData>
-                </a:graphic>
-                <wp14:sizeRelH relativeFrom="margin">
-                  <wp14:pctWidth>0</wp14:pctWidth>
-                </wp14:sizeRelH>
-                <wp14:sizeRelV relativeFrom="margin">
-                  <wp14:pctHeight>0</wp14:pctHeight>
-                </wp14:sizeRelV>
-              </wp:anchor>
-            </w:drawing>
-          </mc:Choice>
-          <mc:Fallback>
-            <w:pict>
-              <v:line w14:anchorId="5D44EFD0" id="Straight Connector 617658003" o:spid="_x0000_s1026" style="position:absolute;left:0;text-align:left;flip:y;z-index:251690496;visibility:visible;mso-wrap-style:square;mso-width-percent:0;mso-height-percent:0;mso-wrap-distance-left:9pt;mso-wrap-distance-top:0;mso-wrap-distance-right:9pt;mso-wrap-distance-bottom:0;mso-position-horizontal:absolute;mso-position-horizontal-relative:text;mso-position-vertical:absolute;mso-position-vertical-relative:text;mso-width-percent:0;mso-height-percent:0;mso-width-relative:margin;mso-height-relative:margin" from="142.5pt,221.8pt" to="142.5pt,273.55pt" o:gfxdata="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" strokecolor="black [3200]" strokeweight="3pt">
-                <v:shadow on="t" color="black" opacity="22937f" origin=",.5" offset="0,.63889mm"/>
-              </v:line>
-            </w:pict>
-          </mc:Fallback>
-        </mc:AlternateContent>
-      </w:r>
-      <w:r>
-        <w:rPr>
-          <w:rFonts w:ascii="Lucida Bright" w:hAnsi="Lucida Bright"/>
-          <w:noProof/>
-          <w:sz w:val="36"/>
-          <w:szCs w:val="36"/>
-          <w:lang w:val="en-GB" w:eastAsia="en-GB"/>
-        </w:rPr>
-        <mc:AlternateContent>
-          <mc:Choice Requires="wps">
-            <w:drawing>
-              <wp:anchor distT="0" distB="0" distL="114300" distR="114300" simplePos="0" relativeHeight="251646464" behindDoc="0" locked="0" layoutInCell="1" allowOverlap="1" wp14:anchorId="7CB827FD" wp14:editId="184CAF2B">
-                <wp:simplePos x="0" y="0"/>
-                <wp:positionH relativeFrom="column">
-                  <wp:posOffset>1809749</wp:posOffset>
-                </wp:positionH>
-                <wp:positionV relativeFrom="paragraph">
-                  <wp:posOffset>2816860</wp:posOffset>
-                </wp:positionV>
-                <wp:extent cx="1019175" cy="57150"/>
-                <wp:effectExtent l="57150" t="38100" r="66675" b="95250"/>
-                <wp:wrapNone/>
-                <wp:docPr id="2094271243" name="Straight Connector 2094271243"/>
-                <wp:cNvGraphicFramePr/>
-                <a:graphic xmlns:a="http://schemas.openxmlformats.org/drawingml/2006/main">
-                  <a:graphicData uri="http://schemas.microsoft.com/office/word/2010/wordprocessingShape">
-                    <wps:wsp>
-                      <wps:cNvCnPr/>
-                      <wps:spPr>
-                        <a:xfrm>
-                          <a:off x="0" y="0"/>
-                          <a:ext cx="1019175" cy="57150"/>
-                        </a:xfrm>
-                        <a:prstGeom prst="line">
-                          <a:avLst/>
-                        </a:prstGeom>
-                      </wps:spPr>
-                      <wps:style>
-                        <a:lnRef idx="3">
-                          <a:schemeClr val="dk1"/>
-                        </a:lnRef>
-                        <a:fillRef idx="0">
-                          <a:schemeClr val="dk1"/>
-                        </a:fillRef>
-                        <a:effectRef idx="2">
-                          <a:schemeClr val="dk1"/>
-                        </a:effectRef>
-                        <a:fontRef idx="minor">
-                          <a:schemeClr val="tx1"/>
-                        </a:fontRef>
-                      </wps:style>
-                      <wps:bodyPr/>
-                    </wps:wsp>
-                  </a:graphicData>
-                </a:graphic>
-                <wp14:sizeRelH relativeFrom="margin">
-                  <wp14:pctWidth>0</wp14:pctWidth>
-                </wp14:sizeRelH>
-                <wp14:sizeRelV relativeFrom="margin">
-                  <wp14:pctHeight>0</wp14:pctHeight>
-                </wp14:sizeRelV>
-              </wp:anchor>
-            </w:drawing>
-          </mc:Choice>
-          <mc:Fallback>
-            <w:pict>
-              <v:line w14:anchorId="22CE3D4C" id="Straight Connector 2094271243" o:spid="_x0000_s1026" style="position:absolute;left:0;text-align:left;z-index:251646464;visibility:visible;mso-wrap-style:square;mso-width-percent:0;mso-height-percent:0;mso-wrap-distance-left:9pt;mso-wrap-distance-top:0;mso-wrap-distance-right:9pt;mso-wrap-distance-bottom:0;mso-position-horizontal:absolute;mso-position-horizontal-relative:text;mso-position-vertical:absolute;mso-position-vertical-relative:text;mso-width-percent:0;mso-height-percent:0;mso-width-relative:margin;mso-height-relative:margin" from="142.5pt,221.8pt" to="222.75pt,226.3pt" o:gfxdata="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" strokecolor="black [3200]" strokeweight="3pt">
-                <v:shadow on="t" color="black" opacity="22937f" origin=",.5" offset="0,.63889mm"/>
-              </v:line>
-            </w:pict>
-          </mc:Fallback>
-        </mc:AlternateContent>
-      </w:r>
-      <w:r>
-        <w:rPr>
-          <w:rFonts w:ascii="Lucida Bright" w:hAnsi="Lucida Bright"/>
-          <w:noProof/>
-          <w:sz w:val="36"/>
-          <w:szCs w:val="36"/>
-          <w:lang w:val="en-GB" w:eastAsia="en-GB"/>
-        </w:rPr>
-        <mc:AlternateContent>
-          <mc:Choice Requires="wps">
-            <w:drawing>
-              <wp:anchor distT="0" distB="0" distL="114300" distR="114300" simplePos="0" relativeHeight="251624960" behindDoc="0" locked="0" layoutInCell="1" allowOverlap="1" wp14:anchorId="5ADB3BBF" wp14:editId="2180E1C7">
-                <wp:simplePos x="0" y="0"/>
-                <wp:positionH relativeFrom="column">
-                  <wp:posOffset>559435</wp:posOffset>
-                </wp:positionH>
-                <wp:positionV relativeFrom="paragraph">
-                  <wp:posOffset>4372610</wp:posOffset>
-                </wp:positionV>
-                <wp:extent cx="3445510" cy="11430"/>
-                <wp:effectExtent l="57150" t="38100" r="59690" b="83820"/>
-                <wp:wrapNone/>
-                <wp:docPr id="3" name="Straight Connector 3"/>
-                <wp:cNvGraphicFramePr/>
-                <a:graphic xmlns:a="http://schemas.openxmlformats.org/drawingml/2006/main">
-                  <a:graphicData uri="http://schemas.microsoft.com/office/word/2010/wordprocessingShape">
-                    <wps:wsp>
-                      <wps:cNvCnPr/>
-                      <wps:spPr>
-                        <a:xfrm flipV="1">
-                          <a:off x="0" y="0"/>
-                          <a:ext cx="3445510" cy="11430"/>
-                        </a:xfrm>
-                        <a:prstGeom prst="line">
-                          <a:avLst/>
-                        </a:prstGeom>
-                      </wps:spPr>
-                      <wps:style>
-                        <a:lnRef idx="3">
-                          <a:schemeClr val="dk1"/>
-                        </a:lnRef>
-                        <a:fillRef idx="0">
-                          <a:schemeClr val="dk1"/>
-                        </a:fillRef>
-                        <a:effectRef idx="2">
-                          <a:schemeClr val="dk1"/>
-                        </a:effectRef>
-                        <a:fontRef idx="minor">
-                          <a:schemeClr val="tx1"/>
-                        </a:fontRef>
-                      </wps:style>
-                      <wps:bodyPr/>
-                    </wps:wsp>
-                  </a:graphicData>
-                </a:graphic>
-                <wp14:sizeRelH relativeFrom="margin">
-                  <wp14:pctWidth>0</wp14:pctWidth>
-                </wp14:sizeRelH>
-                <wp14:sizeRelV relativeFrom="margin">
-                  <wp14:pctHeight>0</wp14:pctHeight>
-                </wp14:sizeRelV>
-              </wp:anchor>
-            </w:drawing>
-          </mc:Choice>
-          <mc:Fallback>
-            <w:pict>
-              <v:line w14:anchorId="1F022395" id="Straight Connector 3" o:spid="_x0000_s1026" style="position:absolute;left:0;text-align:left;flip:y;z-index:251624960;visibility:visible;mso-wrap-style:square;mso-width-percent:0;mso-height-percent:0;mso-wrap-distance-left:9pt;mso-wrap-distance-top:0;mso-wrap-distance-right:9pt;mso-wrap-distance-bottom:0;mso-position-horizontal:absolute;mso-position-horizontal-relative:text;mso-position-vertical:absolute;mso-position-vertical-relative:text;mso-width-percent:0;mso-height-percent:0;mso-width-relative:margin;mso-height-relative:margin" from="44.05pt,344.3pt" to="315.35pt,345.2pt" o:gfxdata="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" strokecolor="black [3200]" strokeweight="3pt">
-                <v:shadow on="t" color="black" opacity="22937f" origin=",.5" offset="0,.63889mm"/>
-              </v:line>
-            </w:pict>
-          </mc:Fallback>
-        </mc:AlternateContent>
-      </w:r>
-      <w:r>
-        <w:rPr>
-          <w:rFonts w:ascii="Lucida Bright" w:hAnsi="Lucida Bright"/>
-          <w:noProof/>
-          <w:sz w:val="36"/>
-          <w:szCs w:val="36"/>
-          <w:lang w:val="en-GB" w:eastAsia="en-GB"/>
-        </w:rPr>
-        <mc:AlternateContent>
-          <mc:Choice Requires="wps">
-            <w:drawing>
-              <wp:anchor distT="0" distB="0" distL="114300" distR="114300" simplePos="0" relativeHeight="251649536" behindDoc="0" locked="0" layoutInCell="1" allowOverlap="1" wp14:anchorId="2BB2C79D" wp14:editId="3E48A304">
-                <wp:simplePos x="0" y="0"/>
-                <wp:positionH relativeFrom="column">
-                  <wp:posOffset>4511040</wp:posOffset>
-                </wp:positionH>
-                <wp:positionV relativeFrom="paragraph">
-                  <wp:posOffset>4335780</wp:posOffset>
-                </wp:positionV>
-                <wp:extent cx="2365375" cy="7620"/>
-                <wp:effectExtent l="57150" t="38100" r="53975" b="87630"/>
-                <wp:wrapNone/>
-                <wp:docPr id="594181792" name="Straight Connector 594181792"/>
-                <wp:cNvGraphicFramePr/>
-                <a:graphic xmlns:a="http://schemas.openxmlformats.org/drawingml/2006/main">
-                  <a:graphicData uri="http://schemas.microsoft.com/office/word/2010/wordprocessingShape">
-                    <wps:wsp>
-                      <wps:cNvCnPr/>
-                      <wps:spPr>
-                        <a:xfrm flipV="1">
-                          <a:off x="0" y="0"/>
-                          <a:ext cx="2365375" cy="7620"/>
-                        </a:xfrm>
-                        <a:prstGeom prst="line">
-                          <a:avLst/>
-                        </a:prstGeom>
-                      </wps:spPr>
-                      <wps:style>
-                        <a:lnRef idx="3">
-                          <a:schemeClr val="dk1"/>
-                        </a:lnRef>
-                        <a:fillRef idx="0">
-                          <a:schemeClr val="dk1"/>
-                        </a:fillRef>
-                        <a:effectRef idx="2">
-                          <a:schemeClr val="dk1"/>
-                        </a:effectRef>
-                        <a:fontRef idx="minor">
-                          <a:schemeClr val="tx1"/>
-                        </a:fontRef>
-                      </wps:style>
-                      <wps:bodyPr/>
-                    </wps:wsp>
-                  </a:graphicData>
-                </a:graphic>
-                <wp14:sizeRelH relativeFrom="margin">
-                  <wp14:pctWidth>0</wp14:pctWidth>
-                </wp14:sizeRelH>
-                <wp14:sizeRelV relativeFrom="margin">
-                  <wp14:pctHeight>0</wp14:pctHeight>
-                </wp14:sizeRelV>
-              </wp:anchor>
-            </w:drawing>
-          </mc:Choice>
-          <mc:Fallback>
-            <w:pict>
-              <v:line w14:anchorId="2C0357C2" id="Straight Connector 594181792" o:spid="_x0000_s1026" style="position:absolute;left:0;text-align:left;flip:y;z-index:251649536;visibility:visible;mso-wrap-style:square;mso-width-percent:0;mso-height-percent:0;mso-wrap-distance-left:9pt;mso-wrap-distance-top:0;mso-wrap-distance-right:9pt;mso-wrap-distance-bottom:0;mso-position-horizontal:absolute;mso-position-horizontal-relative:text;mso-position-vertical:absolute;mso-position-vertical-relative:text;mso-width-percent:0;mso-height-percent:0;mso-width-relative:margin;mso-height-relative:margin" from="355.2pt,341.4pt" to="541.45pt,342pt" o:gfxdata="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" strokecolor="black [3200]" strokeweight="3pt">
-                <v:shadow on="t" color="black" opacity="22937f" origin=",.5" offset="0,.63889mm"/>
-              </v:line>
-            </w:pict>
-          </mc:Fallback>
-        </mc:AlternateContent>
-      </w:r>
-      <w:r>
-        <w:rPr>
-          <w:rFonts w:ascii="Lucida Bright" w:hAnsi="Lucida Bright"/>
-          <w:noProof/>
-          <w:sz w:val="36"/>
-          <w:szCs w:val="36"/>
-        </w:rPr>
-        <mc:AlternateContent>
-          <mc:Choice Requires="wps">
-            <w:drawing>
-              <wp:anchor distT="45720" distB="45720" distL="114300" distR="114300" simplePos="0" relativeHeight="251723264" behindDoc="0" locked="0" layoutInCell="1" allowOverlap="1" wp14:anchorId="632F4CF8" wp14:editId="63A6E6FD">
+              <wp:anchor distT="45720" distB="45720" distL="114300" distR="114300" simplePos="0" relativeHeight="251723264" behindDoc="0" locked="0" layoutInCell="1" allowOverlap="1" wp14:anchorId="632F4CF8" wp14:editId="249B01AC">
                 <wp:simplePos x="0" y="0"/>
                 <wp:positionH relativeFrom="column">
                   <wp:posOffset>1882775</wp:posOffset>
@@ -1364,7 +1153,7 @@
                 <v:stroke joinstyle="miter"/>
                 <v:path gradientshapeok="t" o:connecttype="rect"/>
               </v:shapetype>
-              <v:shape id="Text Box 2" o:spid="_x0000_s1026" type="#_x0000_t202" style="position:absolute;margin-left:148.25pt;margin-top:391.1pt;width:185.9pt;height:110.6pt;z-index:251723264;visibility:visible;mso-wrap-style:square;mso-width-percent:400;mso-height-percent:200;mso-wrap-distance-left:9pt;mso-wrap-distance-top:3.6pt;mso-wrap-distance-right:9pt;mso-wrap-distance-bottom:3.6pt;mso-position-horizontal:absolute;mso-position-horizontal-relative:text;mso-position-vertical:absolute;mso-position-vertical-relative:text;mso-width-percent:400;mso-height-percent:200;mso-width-relative:margin;mso-height-relative:margin;v-text-anchor:top" o:gfxdata="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">
+              <v:shape id="Text Box 2" o:spid="_x0000_s1030" type="#_x0000_t202" style="position:absolute;margin-left:148.25pt;margin-top:391.1pt;width:185.9pt;height:110.6pt;z-index:251723264;visibility:visible;mso-wrap-style:square;mso-width-percent:400;mso-height-percent:200;mso-wrap-distance-left:9pt;mso-wrap-distance-top:3.6pt;mso-wrap-distance-right:9pt;mso-wrap-distance-bottom:3.6pt;mso-position-horizontal:absolute;mso-position-horizontal-relative:text;mso-position-vertical:absolute;mso-position-vertical-relative:text;mso-width-percent:400;mso-height-percent:200;mso-width-relative:margin;mso-height-relative:margin;v-text-anchor:top" o:gfxdata="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">
                 <v:textbox style="mso-fit-shape-to-text:t">
                   <w:txbxContent>
                     <w:p>

</xml_diff>